<commit_message>
Embed all screenshots in Final-Term Submission Document (DOCX & PDF)
</commit_message>
<xml_diff>
--- a/S4-I-21_Hindujashiri_FinalTermDoc.docx
+++ b/S4-I-21_Hindujashiri_FinalTermDoc.docx
@@ -5895,15 +5895,43 @@
     </w:p>
     <w:p>
       <w:pPr>
-        <w:spacing w:after="80"/>
+        <w:keepNext/>
+        <w:spacing w:before="80" w:after="120"/>
+        <w:jc w:val="center"/>
       </w:pPr>
       <w:r>
-        <w:rPr>
-          <w:i/>
-          <w:color w:val="6C757D"/>
-          <w:sz w:val="17"/>
-        </w:rPr>
-        <w:t>[Screenshot referenced from Mid-Term document or repository verification artifacts]</w:t>
+        <w:drawing>
+          <wp:inline xmlns:a="http://schemas.openxmlformats.org/drawingml/2006/main" xmlns:pic="http://schemas.openxmlformats.org/drawingml/2006/picture">
+            <wp:extent cx="5486400" cy="2458434"/>
+            <wp:docPr id="1" name="Picture 1"/>
+            <wp:cNvGraphicFramePr>
+              <a:graphicFrameLocks noChangeAspect="1"/>
+            </wp:cNvGraphicFramePr>
+            <a:graphic>
+              <a:graphicData uri="http://schemas.openxmlformats.org/drawingml/2006/picture">
+                <pic:pic>
+                  <pic:nvPicPr>
+                    <pic:cNvPr id="0" name="image1.png"/>
+                    <pic:cNvPicPr/>
+                  </pic:nvPicPr>
+                  <pic:blipFill>
+                    <a:blip r:embed="rId11"/>
+                    <a:stretch>
+                      <a:fillRect/>
+                    </a:stretch>
+                  </pic:blipFill>
+                  <pic:spPr>
+                    <a:xfrm>
+                      <a:off x="0" y="0"/>
+                      <a:ext cx="5486400" cy="2458434"/>
+                    </a:xfrm>
+                    <a:prstGeom prst="rect"/>
+                  </pic:spPr>
+                </pic:pic>
+              </a:graphicData>
+            </a:graphic>
+          </wp:inline>
+        </w:drawing>
       </w:r>
     </w:p>
     <w:p>
@@ -6222,15 +6250,84 @@
     </w:p>
     <w:p>
       <w:pPr>
-        <w:spacing w:after="80"/>
+        <w:keepNext/>
+        <w:spacing w:before="80" w:after="120"/>
+        <w:jc w:val="center"/>
       </w:pPr>
       <w:r>
-        <w:rPr>
-          <w:i/>
-          <w:color w:val="6C757D"/>
-          <w:sz w:val="17"/>
-        </w:rPr>
-        <w:t>[Screenshot referenced from Mid-Term document or repository verification artifacts]</w:t>
+        <w:drawing>
+          <wp:inline xmlns:a="http://schemas.openxmlformats.org/drawingml/2006/main" xmlns:pic="http://schemas.openxmlformats.org/drawingml/2006/picture">
+            <wp:extent cx="5486400" cy="1081219"/>
+            <wp:docPr id="2" name="Picture 2"/>
+            <wp:cNvGraphicFramePr>
+              <a:graphicFrameLocks noChangeAspect="1"/>
+            </wp:cNvGraphicFramePr>
+            <a:graphic>
+              <a:graphicData uri="http://schemas.openxmlformats.org/drawingml/2006/picture">
+                <pic:pic>
+                  <pic:nvPicPr>
+                    <pic:cNvPr id="0" name="image2.png"/>
+                    <pic:cNvPicPr/>
+                  </pic:nvPicPr>
+                  <pic:blipFill>
+                    <a:blip r:embed="rId12"/>
+                    <a:stretch>
+                      <a:fillRect/>
+                    </a:stretch>
+                  </pic:blipFill>
+                  <pic:spPr>
+                    <a:xfrm>
+                      <a:off x="0" y="0"/>
+                      <a:ext cx="5486400" cy="1081219"/>
+                    </a:xfrm>
+                    <a:prstGeom prst="rect"/>
+                  </pic:spPr>
+                </pic:pic>
+              </a:graphicData>
+            </a:graphic>
+          </wp:inline>
+        </w:drawing>
+      </w:r>
+    </w:p>
+    <w:p>
+      <w:pPr>
+        <w:keepNext/>
+        <w:spacing w:before="80" w:after="120"/>
+        <w:jc w:val="center"/>
+      </w:pPr>
+      <w:r>
+        <w:drawing>
+          <wp:inline xmlns:a="http://schemas.openxmlformats.org/drawingml/2006/main" xmlns:pic="http://schemas.openxmlformats.org/drawingml/2006/picture">
+            <wp:extent cx="5486400" cy="431773"/>
+            <wp:docPr id="3" name="Picture 3"/>
+            <wp:cNvGraphicFramePr>
+              <a:graphicFrameLocks noChangeAspect="1"/>
+            </wp:cNvGraphicFramePr>
+            <a:graphic>
+              <a:graphicData uri="http://schemas.openxmlformats.org/drawingml/2006/picture">
+                <pic:pic>
+                  <pic:nvPicPr>
+                    <pic:cNvPr id="0" name="image3.png"/>
+                    <pic:cNvPicPr/>
+                  </pic:nvPicPr>
+                  <pic:blipFill>
+                    <a:blip r:embed="rId13"/>
+                    <a:stretch>
+                      <a:fillRect/>
+                    </a:stretch>
+                  </pic:blipFill>
+                  <pic:spPr>
+                    <a:xfrm>
+                      <a:off x="0" y="0"/>
+                      <a:ext cx="5486400" cy="431773"/>
+                    </a:xfrm>
+                    <a:prstGeom prst="rect"/>
+                  </pic:spPr>
+                </pic:pic>
+              </a:graphicData>
+            </a:graphic>
+          </wp:inline>
+        </w:drawing>
       </w:r>
     </w:p>
     <w:p>
@@ -6556,8 +6653,8 @@
       <w:r>
         <w:drawing>
           <wp:inline xmlns:a="http://schemas.openxmlformats.org/drawingml/2006/main" xmlns:pic="http://schemas.openxmlformats.org/drawingml/2006/picture">
-            <wp:extent cx="5669280" cy="4047113"/>
-            <wp:docPr id="1" name="Picture 1"/>
+            <wp:extent cx="5486400" cy="3916561"/>
+            <wp:docPr id="4" name="Picture 4"/>
             <wp:cNvGraphicFramePr>
               <a:graphicFrameLocks noChangeAspect="1"/>
             </wp:cNvGraphicFramePr>
@@ -6569,7 +6666,7 @@
                     <pic:cNvPicPr/>
                   </pic:nvPicPr>
                   <pic:blipFill>
-                    <a:blip r:embed="rId11"/>
+                    <a:blip r:embed="rId14"/>
                     <a:stretch>
                       <a:fillRect/>
                     </a:stretch>
@@ -6577,7 +6674,7 @@
                   <pic:spPr>
                     <a:xfrm>
                       <a:off x="0" y="0"/>
-                      <a:ext cx="5669280" cy="4047113"/>
+                      <a:ext cx="5486400" cy="3916561"/>
                     </a:xfrm>
                     <a:prstGeom prst="rect"/>
                   </pic:spPr>
@@ -6911,8 +7008,8 @@
       <w:r>
         <w:drawing>
           <wp:inline xmlns:a="http://schemas.openxmlformats.org/drawingml/2006/main" xmlns:pic="http://schemas.openxmlformats.org/drawingml/2006/picture">
-            <wp:extent cx="5669280" cy="2840176"/>
-            <wp:docPr id="2" name="Picture 2"/>
+            <wp:extent cx="5486400" cy="2748558"/>
+            <wp:docPr id="5" name="Picture 5"/>
             <wp:cNvGraphicFramePr>
               <a:graphicFrameLocks noChangeAspect="1"/>
             </wp:cNvGraphicFramePr>
@@ -6924,7 +7021,7 @@
                     <pic:cNvPicPr/>
                   </pic:nvPicPr>
                   <pic:blipFill>
-                    <a:blip r:embed="rId12"/>
+                    <a:blip r:embed="rId15"/>
                     <a:stretch>
                       <a:fillRect/>
                     </a:stretch>
@@ -6932,7 +7029,48 @@
                   <pic:spPr>
                     <a:xfrm>
                       <a:off x="0" y="0"/>
-                      <a:ext cx="5669280" cy="2840176"/>
+                      <a:ext cx="5486400" cy="2748558"/>
+                    </a:xfrm>
+                    <a:prstGeom prst="rect"/>
+                  </pic:spPr>
+                </pic:pic>
+              </a:graphicData>
+            </a:graphic>
+          </wp:inline>
+        </w:drawing>
+      </w:r>
+    </w:p>
+    <w:p>
+      <w:pPr>
+        <w:keepNext/>
+        <w:spacing w:before="80" w:after="120"/>
+        <w:jc w:val="center"/>
+      </w:pPr>
+      <w:r>
+        <w:drawing>
+          <wp:inline xmlns:a="http://schemas.openxmlformats.org/drawingml/2006/main" xmlns:pic="http://schemas.openxmlformats.org/drawingml/2006/picture">
+            <wp:extent cx="5486400" cy="2795898"/>
+            <wp:docPr id="6" name="Picture 6"/>
+            <wp:cNvGraphicFramePr>
+              <a:graphicFrameLocks noChangeAspect="1"/>
+            </wp:cNvGraphicFramePr>
+            <a:graphic>
+              <a:graphicData uri="http://schemas.openxmlformats.org/drawingml/2006/picture">
+                <pic:pic>
+                  <pic:nvPicPr>
+                    <pic:cNvPr id="0" name="image5.png"/>
+                    <pic:cNvPicPr/>
+                  </pic:nvPicPr>
+                  <pic:blipFill>
+                    <a:blip r:embed="rId16"/>
+                    <a:stretch>
+                      <a:fillRect/>
+                    </a:stretch>
+                  </pic:blipFill>
+                  <pic:spPr>
+                    <a:xfrm>
+                      <a:off x="0" y="0"/>
+                      <a:ext cx="5486400" cy="2795898"/>
                     </a:xfrm>
                     <a:prstGeom prst="rect"/>
                   </pic:spPr>
@@ -7259,15 +7397,43 @@
     </w:p>
     <w:p>
       <w:pPr>
-        <w:spacing w:after="80"/>
+        <w:keepNext/>
+        <w:spacing w:before="80" w:after="120"/>
+        <w:jc w:val="center"/>
       </w:pPr>
       <w:r>
-        <w:rPr>
-          <w:i/>
-          <w:color w:val="6C757D"/>
-          <w:sz w:val="17"/>
-        </w:rPr>
-        <w:t>[Screenshot referenced from Mid-Term document or repository verification artifacts]</w:t>
+        <w:drawing>
+          <wp:inline xmlns:a="http://schemas.openxmlformats.org/drawingml/2006/main" xmlns:pic="http://schemas.openxmlformats.org/drawingml/2006/picture">
+            <wp:extent cx="5486400" cy="2542548"/>
+            <wp:docPr id="7" name="Picture 7"/>
+            <wp:cNvGraphicFramePr>
+              <a:graphicFrameLocks noChangeAspect="1"/>
+            </wp:cNvGraphicFramePr>
+            <a:graphic>
+              <a:graphicData uri="http://schemas.openxmlformats.org/drawingml/2006/picture">
+                <pic:pic>
+                  <pic:nvPicPr>
+                    <pic:cNvPr id="0" name="image7.png"/>
+                    <pic:cNvPicPr/>
+                  </pic:nvPicPr>
+                  <pic:blipFill>
+                    <a:blip r:embed="rId17"/>
+                    <a:stretch>
+                      <a:fillRect/>
+                    </a:stretch>
+                  </pic:blipFill>
+                  <pic:spPr>
+                    <a:xfrm>
+                      <a:off x="0" y="0"/>
+                      <a:ext cx="5486400" cy="2542548"/>
+                    </a:xfrm>
+                    <a:prstGeom prst="rect"/>
+                  </pic:spPr>
+                </pic:pic>
+              </a:graphicData>
+            </a:graphic>
+          </wp:inline>
+        </w:drawing>
       </w:r>
     </w:p>
     <w:p>
@@ -7586,15 +7752,43 @@
     </w:p>
     <w:p>
       <w:pPr>
-        <w:spacing w:after="80"/>
+        <w:keepNext/>
+        <w:spacing w:before="80" w:after="120"/>
+        <w:jc w:val="center"/>
       </w:pPr>
       <w:r>
-        <w:rPr>
-          <w:i/>
-          <w:color w:val="6C757D"/>
-          <w:sz w:val="17"/>
-        </w:rPr>
-        <w:t>[Screenshot referenced from Mid-Term document or repository verification artifacts]</w:t>
+        <w:drawing>
+          <wp:inline xmlns:a="http://schemas.openxmlformats.org/drawingml/2006/main" xmlns:pic="http://schemas.openxmlformats.org/drawingml/2006/picture">
+            <wp:extent cx="5486400" cy="2395833"/>
+            <wp:docPr id="8" name="Picture 8"/>
+            <wp:cNvGraphicFramePr>
+              <a:graphicFrameLocks noChangeAspect="1"/>
+            </wp:cNvGraphicFramePr>
+            <a:graphic>
+              <a:graphicData uri="http://schemas.openxmlformats.org/drawingml/2006/picture">
+                <pic:pic>
+                  <pic:nvPicPr>
+                    <pic:cNvPr id="0" name="image8.png"/>
+                    <pic:cNvPicPr/>
+                  </pic:nvPicPr>
+                  <pic:blipFill>
+                    <a:blip r:embed="rId18"/>
+                    <a:stretch>
+                      <a:fillRect/>
+                    </a:stretch>
+                  </pic:blipFill>
+                  <pic:spPr>
+                    <a:xfrm>
+                      <a:off x="0" y="0"/>
+                      <a:ext cx="5486400" cy="2395833"/>
+                    </a:xfrm>
+                    <a:prstGeom prst="rect"/>
+                  </pic:spPr>
+                </pic:pic>
+              </a:graphicData>
+            </a:graphic>
+          </wp:inline>
+        </w:drawing>
       </w:r>
     </w:p>
     <w:p>
@@ -7913,15 +8107,43 @@
     </w:p>
     <w:p>
       <w:pPr>
-        <w:spacing w:after="80"/>
+        <w:keepNext/>
+        <w:spacing w:before="80" w:after="120"/>
+        <w:jc w:val="center"/>
       </w:pPr>
       <w:r>
-        <w:rPr>
-          <w:i/>
-          <w:color w:val="6C757D"/>
-          <w:sz w:val="17"/>
-        </w:rPr>
-        <w:t>[Screenshot referenced from Mid-Term document or repository verification artifacts]</w:t>
+        <w:drawing>
+          <wp:inline xmlns:a="http://schemas.openxmlformats.org/drawingml/2006/main" xmlns:pic="http://schemas.openxmlformats.org/drawingml/2006/picture">
+            <wp:extent cx="5486400" cy="1479543"/>
+            <wp:docPr id="9" name="Picture 9"/>
+            <wp:cNvGraphicFramePr>
+              <a:graphicFrameLocks noChangeAspect="1"/>
+            </wp:cNvGraphicFramePr>
+            <a:graphic>
+              <a:graphicData uri="http://schemas.openxmlformats.org/drawingml/2006/picture">
+                <pic:pic>
+                  <pic:nvPicPr>
+                    <pic:cNvPr id="0" name="image9.png"/>
+                    <pic:cNvPicPr/>
+                  </pic:nvPicPr>
+                  <pic:blipFill>
+                    <a:blip r:embed="rId19"/>
+                    <a:stretch>
+                      <a:fillRect/>
+                    </a:stretch>
+                  </pic:blipFill>
+                  <pic:spPr>
+                    <a:xfrm>
+                      <a:off x="0" y="0"/>
+                      <a:ext cx="5486400" cy="1479543"/>
+                    </a:xfrm>
+                    <a:prstGeom prst="rect"/>
+                  </pic:spPr>
+                </pic:pic>
+              </a:graphicData>
+            </a:graphic>
+          </wp:inline>
+        </w:drawing>
       </w:r>
     </w:p>
     <w:p>
@@ -8240,15 +8462,84 @@
     </w:p>
     <w:p>
       <w:pPr>
-        <w:spacing w:after="80"/>
+        <w:keepNext/>
+        <w:spacing w:before="80" w:after="120"/>
+        <w:jc w:val="center"/>
       </w:pPr>
       <w:r>
-        <w:rPr>
-          <w:i/>
-          <w:color w:val="6C757D"/>
-          <w:sz w:val="17"/>
-        </w:rPr>
-        <w:t>[Screenshot referenced from Mid-Term document or repository verification artifacts]</w:t>
+        <w:drawing>
+          <wp:inline xmlns:a="http://schemas.openxmlformats.org/drawingml/2006/main" xmlns:pic="http://schemas.openxmlformats.org/drawingml/2006/picture">
+            <wp:extent cx="5486400" cy="1949191"/>
+            <wp:docPr id="10" name="Picture 10"/>
+            <wp:cNvGraphicFramePr>
+              <a:graphicFrameLocks noChangeAspect="1"/>
+            </wp:cNvGraphicFramePr>
+            <a:graphic>
+              <a:graphicData uri="http://schemas.openxmlformats.org/drawingml/2006/picture">
+                <pic:pic>
+                  <pic:nvPicPr>
+                    <pic:cNvPr id="0" name="image10.png"/>
+                    <pic:cNvPicPr/>
+                  </pic:nvPicPr>
+                  <pic:blipFill>
+                    <a:blip r:embed="rId20"/>
+                    <a:stretch>
+                      <a:fillRect/>
+                    </a:stretch>
+                  </pic:blipFill>
+                  <pic:spPr>
+                    <a:xfrm>
+                      <a:off x="0" y="0"/>
+                      <a:ext cx="5486400" cy="1949191"/>
+                    </a:xfrm>
+                    <a:prstGeom prst="rect"/>
+                  </pic:spPr>
+                </pic:pic>
+              </a:graphicData>
+            </a:graphic>
+          </wp:inline>
+        </w:drawing>
+      </w:r>
+    </w:p>
+    <w:p>
+      <w:pPr>
+        <w:keepNext/>
+        <w:spacing w:before="80" w:after="120"/>
+        <w:jc w:val="center"/>
+      </w:pPr>
+      <w:r>
+        <w:drawing>
+          <wp:inline xmlns:a="http://schemas.openxmlformats.org/drawingml/2006/main" xmlns:pic="http://schemas.openxmlformats.org/drawingml/2006/picture">
+            <wp:extent cx="5486400" cy="2276942"/>
+            <wp:docPr id="11" name="Picture 11"/>
+            <wp:cNvGraphicFramePr>
+              <a:graphicFrameLocks noChangeAspect="1"/>
+            </wp:cNvGraphicFramePr>
+            <a:graphic>
+              <a:graphicData uri="http://schemas.openxmlformats.org/drawingml/2006/picture">
+                <pic:pic>
+                  <pic:nvPicPr>
+                    <pic:cNvPr id="0" name="image11.png"/>
+                    <pic:cNvPicPr/>
+                  </pic:nvPicPr>
+                  <pic:blipFill>
+                    <a:blip r:embed="rId21"/>
+                    <a:stretch>
+                      <a:fillRect/>
+                    </a:stretch>
+                  </pic:blipFill>
+                  <pic:spPr>
+                    <a:xfrm>
+                      <a:off x="0" y="0"/>
+                      <a:ext cx="5486400" cy="2276942"/>
+                    </a:xfrm>
+                    <a:prstGeom prst="rect"/>
+                  </pic:spPr>
+                </pic:pic>
+              </a:graphicData>
+            </a:graphic>
+          </wp:inline>
+        </w:drawing>
       </w:r>
     </w:p>
     <w:p>
@@ -8567,15 +8858,43 @@
     </w:p>
     <w:p>
       <w:pPr>
-        <w:spacing w:after="80"/>
+        <w:keepNext/>
+        <w:spacing w:before="80" w:after="120"/>
+        <w:jc w:val="center"/>
       </w:pPr>
       <w:r>
-        <w:rPr>
-          <w:i/>
-          <w:color w:val="6C757D"/>
-          <w:sz w:val="17"/>
-        </w:rPr>
-        <w:t>[Screenshot referenced from Mid-Term document or repository verification artifacts]</w:t>
+        <w:drawing>
+          <wp:inline xmlns:a="http://schemas.openxmlformats.org/drawingml/2006/main" xmlns:pic="http://schemas.openxmlformats.org/drawingml/2006/picture">
+            <wp:extent cx="5486400" cy="3466505"/>
+            <wp:docPr id="12" name="Picture 12"/>
+            <wp:cNvGraphicFramePr>
+              <a:graphicFrameLocks noChangeAspect="1"/>
+            </wp:cNvGraphicFramePr>
+            <a:graphic>
+              <a:graphicData uri="http://schemas.openxmlformats.org/drawingml/2006/picture">
+                <pic:pic>
+                  <pic:nvPicPr>
+                    <pic:cNvPr id="0" name="media_1788457132524.png"/>
+                    <pic:cNvPicPr/>
+                  </pic:nvPicPr>
+                  <pic:blipFill>
+                    <a:blip r:embed="rId22"/>
+                    <a:stretch>
+                      <a:fillRect/>
+                    </a:stretch>
+                  </pic:blipFill>
+                  <pic:spPr>
+                    <a:xfrm>
+                      <a:off x="0" y="0"/>
+                      <a:ext cx="5486400" cy="3466505"/>
+                    </a:xfrm>
+                    <a:prstGeom prst="rect"/>
+                  </pic:spPr>
+                </pic:pic>
+              </a:graphicData>
+            </a:graphic>
+          </wp:inline>
+        </w:drawing>
       </w:r>
     </w:p>
     <w:p>
@@ -8901,8 +9220,8 @@
       <w:r>
         <w:drawing>
           <wp:inline xmlns:a="http://schemas.openxmlformats.org/drawingml/2006/main" xmlns:pic="http://schemas.openxmlformats.org/drawingml/2006/picture">
-            <wp:extent cx="5669280" cy="2762667"/>
-            <wp:docPr id="3" name="Picture 3"/>
+            <wp:extent cx="5486400" cy="2673548"/>
+            <wp:docPr id="13" name="Picture 13"/>
             <wp:cNvGraphicFramePr>
               <a:graphicFrameLocks noChangeAspect="1"/>
             </wp:cNvGraphicFramePr>
@@ -8914,7 +9233,7 @@
                     <pic:cNvPicPr/>
                   </pic:nvPicPr>
                   <pic:blipFill>
-                    <a:blip r:embed="rId13"/>
+                    <a:blip r:embed="rId23"/>
                     <a:stretch>
                       <a:fillRect/>
                     </a:stretch>
@@ -8922,7 +9241,7 @@
                   <pic:spPr>
                     <a:xfrm>
                       <a:off x="0" y="0"/>
-                      <a:ext cx="5669280" cy="2762667"/>
+                      <a:ext cx="5486400" cy="2673548"/>
                     </a:xfrm>
                     <a:prstGeom prst="rect"/>
                   </pic:spPr>
@@ -9256,8 +9575,8 @@
       <w:r>
         <w:drawing>
           <wp:inline xmlns:a="http://schemas.openxmlformats.org/drawingml/2006/main" xmlns:pic="http://schemas.openxmlformats.org/drawingml/2006/picture">
-            <wp:extent cx="5669280" cy="2790349"/>
-            <wp:docPr id="4" name="Picture 4"/>
+            <wp:extent cx="5486400" cy="2700338"/>
+            <wp:docPr id="14" name="Picture 14"/>
             <wp:cNvGraphicFramePr>
               <a:graphicFrameLocks noChangeAspect="1"/>
             </wp:cNvGraphicFramePr>
@@ -9269,7 +9588,7 @@
                     <pic:cNvPicPr/>
                   </pic:nvPicPr>
                   <pic:blipFill>
-                    <a:blip r:embed="rId14"/>
+                    <a:blip r:embed="rId24"/>
                     <a:stretch>
                       <a:fillRect/>
                     </a:stretch>
@@ -9277,7 +9596,48 @@
                   <pic:spPr>
                     <a:xfrm>
                       <a:off x="0" y="0"/>
-                      <a:ext cx="5669280" cy="2790349"/>
+                      <a:ext cx="5486400" cy="2700338"/>
+                    </a:xfrm>
+                    <a:prstGeom prst="rect"/>
+                  </pic:spPr>
+                </pic:pic>
+              </a:graphicData>
+            </a:graphic>
+          </wp:inline>
+        </w:drawing>
+      </w:r>
+    </w:p>
+    <w:p>
+      <w:pPr>
+        <w:keepNext/>
+        <w:spacing w:before="80" w:after="120"/>
+        <w:jc w:val="center"/>
+      </w:pPr>
+      <w:r>
+        <w:drawing>
+          <wp:inline xmlns:a="http://schemas.openxmlformats.org/drawingml/2006/main" xmlns:pic="http://schemas.openxmlformats.org/drawingml/2006/picture">
+            <wp:extent cx="5486400" cy="2689622"/>
+            <wp:docPr id="15" name="Picture 15"/>
+            <wp:cNvGraphicFramePr>
+              <a:graphicFrameLocks noChangeAspect="1"/>
+            </wp:cNvGraphicFramePr>
+            <a:graphic>
+              <a:graphicData uri="http://schemas.openxmlformats.org/drawingml/2006/picture">
+                <pic:pic>
+                  <pic:nvPicPr>
+                    <pic:cNvPr id="0" name="media_1788457010481.png"/>
+                    <pic:cNvPicPr/>
+                  </pic:nvPicPr>
+                  <pic:blipFill>
+                    <a:blip r:embed="rId25"/>
+                    <a:stretch>
+                      <a:fillRect/>
+                    </a:stretch>
+                  </pic:blipFill>
+                  <pic:spPr>
+                    <a:xfrm>
+                      <a:off x="0" y="0"/>
+                      <a:ext cx="5486400" cy="2689622"/>
                     </a:xfrm>
                     <a:prstGeom prst="rect"/>
                   </pic:spPr>
@@ -9611,8 +9971,8 @@
       <w:r>
         <w:drawing>
           <wp:inline xmlns:a="http://schemas.openxmlformats.org/drawingml/2006/main" xmlns:pic="http://schemas.openxmlformats.org/drawingml/2006/picture">
-            <wp:extent cx="5669280" cy="2746058"/>
-            <wp:docPr id="5" name="Picture 5"/>
+            <wp:extent cx="5486400" cy="2657475"/>
+            <wp:docPr id="16" name="Picture 16"/>
             <wp:cNvGraphicFramePr>
               <a:graphicFrameLocks noChangeAspect="1"/>
             </wp:cNvGraphicFramePr>
@@ -9624,7 +9984,7 @@
                     <pic:cNvPicPr/>
                   </pic:nvPicPr>
                   <pic:blipFill>
-                    <a:blip r:embed="rId15"/>
+                    <a:blip r:embed="rId26"/>
                     <a:stretch>
                       <a:fillRect/>
                     </a:stretch>
@@ -9632,7 +9992,7 @@
                   <pic:spPr>
                     <a:xfrm>
                       <a:off x="0" y="0"/>
-                      <a:ext cx="5669280" cy="2746058"/>
+                      <a:ext cx="5486400" cy="2657475"/>
                     </a:xfrm>
                     <a:prstGeom prst="rect"/>
                   </pic:spPr>
@@ -9966,8 +10326,8 @@
       <w:r>
         <w:drawing>
           <wp:inline xmlns:a="http://schemas.openxmlformats.org/drawingml/2006/main" xmlns:pic="http://schemas.openxmlformats.org/drawingml/2006/picture">
-            <wp:extent cx="5669280" cy="2668548"/>
-            <wp:docPr id="6" name="Picture 6"/>
+            <wp:extent cx="5486400" cy="2582466"/>
+            <wp:docPr id="17" name="Picture 17"/>
             <wp:cNvGraphicFramePr>
               <a:graphicFrameLocks noChangeAspect="1"/>
             </wp:cNvGraphicFramePr>
@@ -9979,7 +10339,7 @@
                     <pic:cNvPicPr/>
                   </pic:nvPicPr>
                   <pic:blipFill>
-                    <a:blip r:embed="rId16"/>
+                    <a:blip r:embed="rId27"/>
                     <a:stretch>
                       <a:fillRect/>
                     </a:stretch>
@@ -9987,7 +10347,7 @@
                   <pic:spPr>
                     <a:xfrm>
                       <a:off x="0" y="0"/>
-                      <a:ext cx="5669280" cy="2668548"/>
+                      <a:ext cx="5486400" cy="2582466"/>
                     </a:xfrm>
                     <a:prstGeom prst="rect"/>
                   </pic:spPr>
@@ -10314,15 +10674,43 @@
     </w:p>
     <w:p>
       <w:pPr>
-        <w:spacing w:after="80"/>
+        <w:keepNext/>
+        <w:spacing w:before="80" w:after="120"/>
+        <w:jc w:val="center"/>
       </w:pPr>
       <w:r>
-        <w:rPr>
-          <w:i/>
-          <w:color w:val="6C757D"/>
-          <w:sz w:val="17"/>
-        </w:rPr>
-        <w:t>[Screenshot referenced from Mid-Term document or repository verification artifacts]</w:t>
+        <w:drawing>
+          <wp:inline xmlns:a="http://schemas.openxmlformats.org/drawingml/2006/main" xmlns:pic="http://schemas.openxmlformats.org/drawingml/2006/picture">
+            <wp:extent cx="5486400" cy="1554564"/>
+            <wp:docPr id="18" name="Picture 18"/>
+            <wp:cNvGraphicFramePr>
+              <a:graphicFrameLocks noChangeAspect="1"/>
+            </wp:cNvGraphicFramePr>
+            <a:graphic>
+              <a:graphicData uri="http://schemas.openxmlformats.org/drawingml/2006/picture">
+                <pic:pic>
+                  <pic:nvPicPr>
+                    <pic:cNvPr id="0" name="Screenshot 2026-07-15 033328.png"/>
+                    <pic:cNvPicPr/>
+                  </pic:nvPicPr>
+                  <pic:blipFill>
+                    <a:blip r:embed="rId28"/>
+                    <a:stretch>
+                      <a:fillRect/>
+                    </a:stretch>
+                  </pic:blipFill>
+                  <pic:spPr>
+                    <a:xfrm>
+                      <a:off x="0" y="0"/>
+                      <a:ext cx="5486400" cy="1554564"/>
+                    </a:xfrm>
+                    <a:prstGeom prst="rect"/>
+                  </pic:spPr>
+                </pic:pic>
+              </a:graphicData>
+            </a:graphic>
+          </wp:inline>
+        </w:drawing>
       </w:r>
     </w:p>
     <w:p>
@@ -10641,15 +11029,43 @@
     </w:p>
     <w:p>
       <w:pPr>
-        <w:spacing w:after="80"/>
+        <w:keepNext/>
+        <w:spacing w:before="80" w:after="120"/>
+        <w:jc w:val="center"/>
       </w:pPr>
       <w:r>
-        <w:rPr>
-          <w:i/>
-          <w:color w:val="6C757D"/>
-          <w:sz w:val="17"/>
-        </w:rPr>
-        <w:t>[Screenshot referenced from Mid-Term document or repository verification artifacts]</w:t>
+        <w:drawing>
+          <wp:inline xmlns:a="http://schemas.openxmlformats.org/drawingml/2006/main" xmlns:pic="http://schemas.openxmlformats.org/drawingml/2006/picture">
+            <wp:extent cx="5486400" cy="2662833"/>
+            <wp:docPr id="19" name="Picture 19"/>
+            <wp:cNvGraphicFramePr>
+              <a:graphicFrameLocks noChangeAspect="1"/>
+            </wp:cNvGraphicFramePr>
+            <a:graphic>
+              <a:graphicData uri="http://schemas.openxmlformats.org/drawingml/2006/picture">
+                <pic:pic>
+                  <pic:nvPicPr>
+                    <pic:cNvPr id="0" name="media_1788445209551.png"/>
+                    <pic:cNvPicPr/>
+                  </pic:nvPicPr>
+                  <pic:blipFill>
+                    <a:blip r:embed="rId29"/>
+                    <a:stretch>
+                      <a:fillRect/>
+                    </a:stretch>
+                  </pic:blipFill>
+                  <pic:spPr>
+                    <a:xfrm>
+                      <a:off x="0" y="0"/>
+                      <a:ext cx="5486400" cy="2662833"/>
+                    </a:xfrm>
+                    <a:prstGeom prst="rect"/>
+                  </pic:spPr>
+                </pic:pic>
+              </a:graphicData>
+            </a:graphic>
+          </wp:inline>
+        </w:drawing>
       </w:r>
     </w:p>
     <w:p>

</xml_diff>

<commit_message>
Update live Azure URL in Final-Term Submission Document (DOCX & PDF)
</commit_message>
<xml_diff>
--- a/S4-I-21_Hindujashiri_FinalTermDoc.docx
+++ b/S4-I-21_Hindujashiri_FinalTermDoc.docx
@@ -11206,7 +11206,7 @@
                 <w:b w:val="0"/>
                 <w:sz w:val="19"/>
               </w:rPr>
-              <w:t>b219ea6 (03-Sep-2026)</w:t>
+              <w:t>81f9850 (03-Sep-2026)</w:t>
             </w:r>
           </w:p>
         </w:tc>
@@ -11261,7 +11261,7 @@
                 <w:b w:val="0"/>
                 <w:sz w:val="19"/>
               </w:rPr>
-              <w:t>http://localhost:5173 (Live interactive demo) / Azure Static Web Apps</w:t>
+              <w:t>https://brave-grass-04da7490f.6.azurestaticapps.net (Live on Azure)</w:t>
             </w:r>
           </w:p>
         </w:tc>

</xml_diff>